<commit_message>
nmctapp: amicus, petition-for-writ, reply and motion latex gated (notes after a sign token kept), motion docx gated, opening docx gated with docx_bias 0.05 (fb-595.54.54)
Co-Authored-By: Claude Opus 5.5 <noreply@anthropic.com>
</commit_message>
<xml_diff>
--- a/courts/tenth-circuit/new-mexico/state/court-of-appeals/opening-brief/usage/OUTPUT-opening-brief.docx
+++ b/courts/tenth-circuit/new-mexico/state/court-of-appeals/opening-brief/usage/OUTPUT-opening-brief.docx
@@ -205,7 +205,7 @@
     </w:p>
     <w:tbl>
       <w:tblPr>
-        <w:tblW w:w="9360" w:type="dxa"/>
+        <w:tblW w:w="9359" w:type="dxa"/>
         <w:tblLayout w:type="fixed"/>
         <w:tblCellMar>
           <w:top w:w="0" w:type="dxa"/>
@@ -216,7 +216,7 @@
         <w:tblLook w:val="0000" w:firstRow="0" w:lastRow="0" w:firstColumn="0" w:lastColumn="0" w:noHBand="0" w:noVBand="0"/>
       </w:tblPr>
       <w:tblGrid>
-        <w:gridCol w:w="5760"/>
+        <w:gridCol w:w="5759"/>
         <w:gridCol w:w="3600"/>
       </w:tblGrid>
       <w:tr>
@@ -225,7 +225,7 @@
         </w:trPr>
         <w:tc>
           <w:tcPr>
-            <w:tcW w:w="5760" w:type="dxa"/>
+            <w:tcW w:w="5759" w:type="dxa"/>
           </w:tcPr>
           <w:p>
             <w:pPr>
@@ -2197,7 +2197,7 @@
     </w:p>
     <w:tbl>
       <w:tblPr>
-        <w:tblW w:w="9360" w:type="dxa"/>
+        <w:tblW w:w="9359" w:type="dxa"/>
         <w:tblLayout w:type="fixed"/>
         <w:tblCellMar>
           <w:top w:w="0" w:type="dxa"/>
@@ -2208,7 +2208,7 @@
         <w:tblLook w:val="0000" w:firstRow="0" w:lastRow="0" w:firstColumn="0" w:lastColumn="0" w:noHBand="0" w:noVBand="0"/>
       </w:tblPr>
       <w:tblGrid>
-        <w:gridCol w:w="4464"/>
+        <w:gridCol w:w="4463"/>
         <w:gridCol w:w="4896"/>
       </w:tblGrid>
       <w:tr>
@@ -2217,7 +2217,7 @@
         </w:trPr>
         <w:tc>
           <w:tcPr>
-            <w:tcW w:w="4464" w:type="dxa"/>
+            <w:tcW w:w="4463" w:type="dxa"/>
           </w:tcPr>
           <w:p>
             <w:pPr>
@@ -2503,7 +2503,7 @@
         <w:sectPr>
           <w:footerReference w:type="default" r:id="rIdXdNone"/>
           <w:pgSz w:w="12240" w:h="15840"/>
-          <w:pgMar w:top="1440" w:right="1440" w:bottom="1440" w:left="1440" w:header="720" w:footer="686" w:gutter="0"/>
+          <w:pgMar w:top="1440" w:right="1441" w:bottom="1440" w:left="1440" w:header="720" w:footer="686" w:gutter="0"/>
         </w:sectPr>
       </w:pPr>
     </w:p>
@@ -2555,7 +2555,7 @@
       <w:pPr>
         <w:keepLines/>
         <w:tabs>
-          <w:tab w:val="right" w:leader="dot" w:pos="9360"/>
+          <w:tab w:val="right" w:leader="dot" w:pos="9359"/>
         </w:tabs>
         <w:spacing w:before="252" w:after="0" w:line="322" w:lineRule="exact"/>
         <w:ind w:left="0" w:right="720" w:firstLine="0"/>
@@ -2589,7 +2589,7 @@
       <w:pPr>
         <w:keepLines/>
         <w:tabs>
-          <w:tab w:val="right" w:leader="dot" w:pos="9360"/>
+          <w:tab w:val="right" w:leader="dot" w:pos="9359"/>
         </w:tabs>
         <w:spacing w:before="252" w:after="0" w:line="322" w:lineRule="exact"/>
         <w:ind w:left="0" w:right="720" w:firstLine="0"/>
@@ -2629,7 +2629,7 @@
       <w:pPr>
         <w:keepLines/>
         <w:tabs>
-          <w:tab w:val="right" w:leader="dot" w:pos="9360"/>
+          <w:tab w:val="right" w:leader="dot" w:pos="9359"/>
         </w:tabs>
         <w:spacing w:before="252" w:after="0" w:line="322" w:lineRule="exact"/>
         <w:ind w:left="0" w:right="720" w:firstLine="0"/>
@@ -2651,7 +2651,7 @@
       <w:pPr>
         <w:keepLines/>
         <w:tabs>
-          <w:tab w:val="right" w:leader="dot" w:pos="9360"/>
+          <w:tab w:val="right" w:leader="dot" w:pos="9359"/>
         </w:tabs>
         <w:spacing w:before="252" w:after="0" w:line="322" w:lineRule="exact"/>
         <w:ind w:left="0" w:right="720" w:firstLine="0"/>
@@ -2691,7 +2691,7 @@
       <w:pPr>
         <w:keepLines/>
         <w:tabs>
-          <w:tab w:val="right" w:leader="dot" w:pos="9360"/>
+          <w:tab w:val="right" w:leader="dot" w:pos="9359"/>
         </w:tabs>
         <w:spacing w:before="252" w:after="0" w:line="322" w:lineRule="exact"/>
         <w:ind w:left="0" w:right="720" w:firstLine="0"/>
@@ -2773,7 +2773,7 @@
       <w:pPr>
         <w:keepLines/>
         <w:tabs>
-          <w:tab w:val="right" w:leader="dot" w:pos="9360"/>
+          <w:tab w:val="right" w:leader="dot" w:pos="9359"/>
         </w:tabs>
         <w:spacing w:before="252" w:after="0" w:line="322" w:lineRule="exact"/>
         <w:ind w:left="0" w:right="720" w:firstLine="0"/>
@@ -2813,7 +2813,7 @@
       <w:pPr>
         <w:keepLines/>
         <w:tabs>
-          <w:tab w:val="right" w:leader="dot" w:pos="9360"/>
+          <w:tab w:val="right" w:leader="dot" w:pos="9359"/>
         </w:tabs>
         <w:spacing w:before="252" w:after="0" w:line="322" w:lineRule="exact"/>
         <w:ind w:left="0" w:right="720" w:firstLine="0"/>
@@ -2841,7 +2841,7 @@
       <w:pPr>
         <w:keepLines/>
         <w:tabs>
-          <w:tab w:val="right" w:leader="dot" w:pos="9360"/>
+          <w:tab w:val="right" w:leader="dot" w:pos="9359"/>
         </w:tabs>
         <w:spacing w:before="252" w:after="0" w:line="322" w:lineRule="exact"/>
         <w:ind w:left="420" w:right="720" w:firstLine="0"/>
@@ -2923,7 +2923,7 @@
       <w:pPr>
         <w:keepLines/>
         <w:tabs>
-          <w:tab w:val="right" w:leader="dot" w:pos="9360"/>
+          <w:tab w:val="right" w:leader="dot" w:pos="9359"/>
         </w:tabs>
         <w:spacing w:before="252" w:after="0" w:line="322" w:lineRule="exact"/>
         <w:ind w:left="420" w:right="720" w:firstLine="0"/>
@@ -3011,7 +3011,7 @@
       <w:pPr>
         <w:keepLines/>
         <w:tabs>
-          <w:tab w:val="right" w:leader="dot" w:pos="9360"/>
+          <w:tab w:val="right" w:leader="dot" w:pos="9359"/>
         </w:tabs>
         <w:spacing w:before="252" w:after="0" w:line="322" w:lineRule="exact"/>
         <w:ind w:left="420" w:right="720" w:firstLine="0"/>
@@ -3075,7 +3075,7 @@
       <w:pPr>
         <w:keepLines/>
         <w:tabs>
-          <w:tab w:val="right" w:leader="dot" w:pos="9360"/>
+          <w:tab w:val="right" w:leader="dot" w:pos="9359"/>
         </w:tabs>
         <w:spacing w:before="252" w:after="0" w:line="322" w:lineRule="exact"/>
         <w:ind w:left="420" w:right="720" w:firstLine="0"/>
@@ -3133,7 +3133,7 @@
       <w:pPr>
         <w:keepLines/>
         <w:tabs>
-          <w:tab w:val="right" w:leader="dot" w:pos="9360"/>
+          <w:tab w:val="right" w:leader="dot" w:pos="9359"/>
         </w:tabs>
         <w:spacing w:before="252" w:after="0" w:line="322" w:lineRule="exact"/>
         <w:ind w:left="420" w:right="720" w:firstLine="0"/>
@@ -3209,7 +3209,7 @@
       <w:pPr>
         <w:keepLines/>
         <w:tabs>
-          <w:tab w:val="right" w:leader="dot" w:pos="9360"/>
+          <w:tab w:val="right" w:leader="dot" w:pos="9359"/>
         </w:tabs>
         <w:spacing w:before="252" w:after="0" w:line="322" w:lineRule="exact"/>
         <w:ind w:left="420" w:right="720" w:firstLine="0"/>
@@ -3273,7 +3273,7 @@
       <w:pPr>
         <w:keepLines/>
         <w:tabs>
-          <w:tab w:val="right" w:leader="dot" w:pos="9360"/>
+          <w:tab w:val="right" w:leader="dot" w:pos="9359"/>
         </w:tabs>
         <w:spacing w:before="252" w:after="0" w:line="322" w:lineRule="exact"/>
         <w:ind w:left="0" w:right="720" w:firstLine="0"/>
@@ -3584,7 +3584,7 @@
     </w:p>
     <w:tbl>
       <w:tblPr>
-        <w:tblW w:w="9360" w:type="dxa"/>
+        <w:tblW w:w="9359" w:type="dxa"/>
         <w:tblLayout w:type="fixed"/>
         <w:tblCellMar>
           <w:top w:w="0" w:type="dxa"/>
@@ -3595,7 +3595,7 @@
         <w:tblLook w:val="0000" w:firstRow="0" w:lastRow="0" w:firstColumn="0" w:lastColumn="0" w:noHBand="0" w:noVBand="0"/>
       </w:tblPr>
       <w:tblGrid>
-        <w:gridCol w:w="9360"/>
+        <w:gridCol w:w="9359"/>
       </w:tblGrid>
       <w:tr>
         <w:trPr>
@@ -3603,7 +3603,7 @@
         </w:trPr>
         <w:tc>
           <w:tcPr>
-            <w:tcW w:w="9360" w:type="dxa"/>
+            <w:tcW w:w="9359" w:type="dxa"/>
           </w:tcPr>
           <w:p>
             <w:pPr>
@@ -4021,7 +4021,7 @@
       <w:pPr>
         <w:keepLines/>
         <w:tabs>
-          <w:tab w:val="right" w:leader="dot" w:pos="9360"/>
+          <w:tab w:val="right" w:leader="dot" w:pos="9359"/>
         </w:tabs>
         <w:spacing w:before="252" w:after="0" w:line="322" w:lineRule="exact"/>
         <w:ind w:left="420" w:right="1120" w:hanging="420"/>
@@ -4206,7 +4206,7 @@
       <w:pPr>
         <w:keepLines/>
         <w:tabs>
-          <w:tab w:val="right" w:leader="dot" w:pos="9360"/>
+          <w:tab w:val="right" w:leader="dot" w:pos="9359"/>
         </w:tabs>
         <w:spacing w:before="252" w:after="0" w:line="322" w:lineRule="exact"/>
         <w:ind w:left="420" w:right="1120" w:hanging="420"/>
@@ -4401,7 +4401,7 @@
       <w:pPr>
         <w:keepLines/>
         <w:tabs>
-          <w:tab w:val="right" w:leader="dot" w:pos="9360"/>
+          <w:tab w:val="right" w:leader="dot" w:pos="9359"/>
         </w:tabs>
         <w:spacing w:before="252" w:after="0" w:line="322" w:lineRule="exact"/>
         <w:ind w:left="420" w:right="1120" w:hanging="420"/>
@@ -4558,7 +4558,7 @@
       <w:pPr>
         <w:keepLines/>
         <w:tabs>
-          <w:tab w:val="right" w:leader="dot" w:pos="9360"/>
+          <w:tab w:val="right" w:leader="dot" w:pos="9359"/>
         </w:tabs>
         <w:spacing w:before="252" w:after="0" w:line="322" w:lineRule="exact"/>
         <w:ind w:left="420" w:right="1120" w:hanging="420"/>
@@ -4729,7 +4729,7 @@
       <w:pPr>
         <w:keepLines/>
         <w:tabs>
-          <w:tab w:val="right" w:leader="dot" w:pos="9360"/>
+          <w:tab w:val="right" w:leader="dot" w:pos="9359"/>
         </w:tabs>
         <w:spacing w:before="252" w:after="0" w:line="322" w:lineRule="exact"/>
         <w:ind w:left="420" w:right="1120" w:hanging="420"/>
@@ -4882,7 +4882,7 @@
       <w:pPr>
         <w:keepLines/>
         <w:tabs>
-          <w:tab w:val="right" w:leader="dot" w:pos="9360"/>
+          <w:tab w:val="right" w:leader="dot" w:pos="9359"/>
         </w:tabs>
         <w:spacing w:before="252" w:after="0" w:line="322" w:lineRule="exact"/>
         <w:ind w:left="420" w:right="1120" w:hanging="420"/>
@@ -5067,7 +5067,7 @@
       <w:pPr>
         <w:keepLines/>
         <w:tabs>
-          <w:tab w:val="right" w:leader="dot" w:pos="9360"/>
+          <w:tab w:val="right" w:leader="dot" w:pos="9359"/>
         </w:tabs>
         <w:spacing w:before="252" w:after="0" w:line="322" w:lineRule="exact"/>
         <w:ind w:left="420" w:right="1120" w:hanging="420"/>
@@ -5224,7 +5224,7 @@
       <w:pPr>
         <w:keepLines/>
         <w:tabs>
-          <w:tab w:val="right" w:leader="dot" w:pos="9360"/>
+          <w:tab w:val="right" w:leader="dot" w:pos="9359"/>
         </w:tabs>
         <w:spacing w:before="252" w:after="0" w:line="322" w:lineRule="exact"/>
         <w:ind w:left="420" w:right="1120" w:hanging="420"/>
@@ -5367,7 +5367,7 @@
       <w:pPr>
         <w:keepLines/>
         <w:tabs>
-          <w:tab w:val="right" w:leader="dot" w:pos="9360"/>
+          <w:tab w:val="right" w:leader="dot" w:pos="9359"/>
         </w:tabs>
         <w:spacing w:before="252" w:after="0" w:line="322" w:lineRule="exact"/>
         <w:ind w:left="420" w:right="1120" w:hanging="420"/>
@@ -5496,7 +5496,7 @@
       <w:pPr>
         <w:keepLines/>
         <w:tabs>
-          <w:tab w:val="right" w:leader="dot" w:pos="9360"/>
+          <w:tab w:val="right" w:leader="dot" w:pos="9359"/>
         </w:tabs>
         <w:spacing w:before="252" w:after="0" w:line="322" w:lineRule="exact"/>
         <w:ind w:left="420" w:right="1120" w:hanging="420"/>
@@ -5695,7 +5695,7 @@
       <w:pPr>
         <w:keepLines/>
         <w:tabs>
-          <w:tab w:val="right" w:leader="dot" w:pos="9360"/>
+          <w:tab w:val="right" w:leader="dot" w:pos="9359"/>
         </w:tabs>
         <w:spacing w:before="252" w:after="0" w:line="322" w:lineRule="exact"/>
         <w:ind w:left="420" w:right="1120" w:hanging="420"/>
@@ -5824,7 +5824,7 @@
       <w:pPr>
         <w:keepLines/>
         <w:tabs>
-          <w:tab w:val="right" w:leader="dot" w:pos="9360"/>
+          <w:tab w:val="right" w:leader="dot" w:pos="9359"/>
         </w:tabs>
         <w:spacing w:before="252" w:after="0" w:line="322" w:lineRule="exact"/>
         <w:ind w:left="420" w:right="1120" w:hanging="420"/>
@@ -5991,7 +5991,7 @@
       <w:pPr>
         <w:keepLines/>
         <w:tabs>
-          <w:tab w:val="right" w:leader="dot" w:pos="9360"/>
+          <w:tab w:val="right" w:leader="dot" w:pos="9359"/>
         </w:tabs>
         <w:spacing w:before="252" w:after="0" w:line="322" w:lineRule="exact"/>
         <w:ind w:left="420" w:right="1120" w:hanging="420"/>
@@ -6172,7 +6172,7 @@
       <w:pPr>
         <w:keepLines/>
         <w:tabs>
-          <w:tab w:val="right" w:leader="dot" w:pos="9360"/>
+          <w:tab w:val="right" w:leader="dot" w:pos="9359"/>
         </w:tabs>
         <w:spacing w:before="252" w:after="0" w:line="322" w:lineRule="exact"/>
         <w:ind w:left="420" w:right="1120" w:hanging="420"/>
@@ -6429,7 +6429,7 @@
       <w:pPr>
         <w:keepLines/>
         <w:tabs>
-          <w:tab w:val="right" w:leader="dot" w:pos="9360"/>
+          <w:tab w:val="right" w:leader="dot" w:pos="9359"/>
         </w:tabs>
         <w:spacing w:before="252" w:after="0" w:line="322" w:lineRule="exact"/>
         <w:ind w:left="420" w:right="1120" w:hanging="420"/>
@@ -6473,7 +6473,7 @@
       <w:pPr>
         <w:keepLines/>
         <w:tabs>
-          <w:tab w:val="right" w:leader="dot" w:pos="9360"/>
+          <w:tab w:val="right" w:leader="dot" w:pos="9359"/>
         </w:tabs>
         <w:spacing w:before="252" w:after="0" w:line="322" w:lineRule="exact"/>
         <w:ind w:left="420" w:right="1120" w:hanging="420"/>
@@ -6517,7 +6517,7 @@
       <w:pPr>
         <w:keepLines/>
         <w:tabs>
-          <w:tab w:val="right" w:leader="dot" w:pos="9360"/>
+          <w:tab w:val="right" w:leader="dot" w:pos="9359"/>
         </w:tabs>
         <w:spacing w:before="252" w:after="0" w:line="322" w:lineRule="exact"/>
         <w:ind w:left="420" w:right="1540" w:hanging="420"/>
@@ -6561,7 +6561,7 @@
       <w:pPr>
         <w:keepLines/>
         <w:tabs>
-          <w:tab w:val="right" w:leader="dot" w:pos="9360"/>
+          <w:tab w:val="right" w:leader="dot" w:pos="9359"/>
         </w:tabs>
         <w:spacing w:before="252" w:after="0" w:line="322" w:lineRule="exact"/>
         <w:ind w:left="420" w:right="1120" w:hanging="420"/>
@@ -6605,7 +6605,7 @@
       <w:pPr>
         <w:keepLines/>
         <w:tabs>
-          <w:tab w:val="right" w:leader="dot" w:pos="9360"/>
+          <w:tab w:val="right" w:leader="dot" w:pos="9359"/>
         </w:tabs>
         <w:spacing w:before="252" w:after="0" w:line="322" w:lineRule="exact"/>
         <w:ind w:left="420" w:right="5880" w:hanging="420"/>
@@ -6633,7 +6633,7 @@
       <w:pPr>
         <w:keepLines/>
         <w:tabs>
-          <w:tab w:val="right" w:leader="dot" w:pos="9360"/>
+          <w:tab w:val="right" w:leader="dot" w:pos="9359"/>
         </w:tabs>
         <w:spacing w:before="252" w:after="0" w:line="322" w:lineRule="exact"/>
         <w:ind w:left="420" w:right="1120" w:hanging="420"/>
@@ -6663,7 +6663,7 @@
         <w:sectPr>
           <w:footerReference w:type="default" r:id="rIdXdPage"/>
           <w:pgSz w:w="12240" w:h="15840"/>
-          <w:pgMar w:top="1440" w:right="1440" w:bottom="1440" w:left="1440" w:header="720" w:footer="686" w:gutter="0"/>
+          <w:pgMar w:top="1440" w:right="1441" w:bottom="1440" w:left="1440" w:header="720" w:footer="686" w:gutter="0"/>
           <w:pgNumType w:fmt="lowerRoman" w:start="1"/>
         </w:sectPr>
       </w:pPr>
@@ -7029,7 +7029,7 @@
         <w:pStyle w:val="BodyTextNote"/>
       </w:pPr>
       <w:r>
-        <w:t xml:space="preserve">Because no issue of a county-wide requirement for BACT for 15 listed HAPs was part of any proposed rule or was proposed in opening arguments, testimony on application of BACT to HAPs was limited. Paul Wade testified that BACT was best utilized for particulate emissions. TR 1718. No one testified to the statement in the Final Order and Statement of Reasons that “…the adopted regulation also puts a modest burden on those seeking to emit HAPs by requiring BACT analysis, whether or not the permit applicant seeks to emit HAPs in an Overburdened Area.” Final Order at ¶ 12 [RP at1782]. ]; Wade testimony, Tr. at 1753</w:t>
+        <w:t xml:space="preserve">Because no issue of a county-wide requirement for BACT for 15 listed HAPs was part of any proposed rule or was proposed in opening arguments, testimony on application of BACT to HAPs was limited. Paul Wade testified that BACT was best utilized for particulate emissions. TR 1718. No one testified to the statement in the Final Order and Statement of Reasons that “…the adopted regulation also puts a modest burden on those seeking to emit HAPs by requiring BACT analysis, whether or not the permit applicant seeks to emit HAPs in an Overburdened Area.” Final Order at ¶ 12 [RP at1782]. ⁠]; Wade testimony, Tr. at 1753</w:t>
       </w:r>
       <w:r>
         <w:noBreakHyphen/>
@@ -9343,7 +9343,7 @@
     </w:p>
     <w:tbl>
       <w:tblPr>
-        <w:tblW w:w="9360" w:type="dxa"/>
+        <w:tblW w:w="9359" w:type="dxa"/>
         <w:tblLayout w:type="fixed"/>
         <w:tblCellMar>
           <w:top w:w="0" w:type="dxa"/>
@@ -9354,7 +9354,7 @@
         <w:tblLook w:val="0000" w:firstRow="0" w:lastRow="0" w:firstColumn="0" w:lastColumn="0" w:noHBand="0" w:noVBand="0"/>
       </w:tblPr>
       <w:tblGrid>
-        <w:gridCol w:w="9360"/>
+        <w:gridCol w:w="9359"/>
       </w:tblGrid>
       <w:tr>
         <w:trPr>
@@ -9362,7 +9362,7 @@
         </w:trPr>
         <w:tc>
           <w:tcPr>
-            <w:tcW w:w="9360" w:type="dxa"/>
+            <w:tcW w:w="9359" w:type="dxa"/>
           </w:tcPr>
           <w:p>
             <w:pPr>
@@ -9993,7 +9993,7 @@
     </w:p>
     <w:tbl>
       <w:tblPr>
-        <w:tblW w:w="9360" w:type="dxa"/>
+        <w:tblW w:w="9359" w:type="dxa"/>
         <w:tblLayout w:type="fixed"/>
         <w:tblCellMar>
           <w:top w:w="0" w:type="dxa"/>
@@ -10004,7 +10004,7 @@
         <w:tblLook w:val="0000" w:firstRow="0" w:lastRow="0" w:firstColumn="0" w:lastColumn="0" w:noHBand="0" w:noVBand="0"/>
       </w:tblPr>
       <w:tblGrid>
-        <w:gridCol w:w="9360"/>
+        <w:gridCol w:w="9359"/>
       </w:tblGrid>
       <w:tr>
         <w:trPr>
@@ -10012,7 +10012,7 @@
         </w:trPr>
         <w:tc>
           <w:tcPr>
-            <w:tcW w:w="9360" w:type="dxa"/>
+            <w:tcW w:w="9359" w:type="dxa"/>
           </w:tcPr>
           <w:p>
             <w:pPr>
@@ -10335,7 +10335,7 @@
     <w:sectPr>
       <w:footerReference w:type="default" r:id="rIdXdPage"/>
       <w:pgSz w:w="12240" w:h="15840"/>
-      <w:pgMar w:top="1440" w:right="1440" w:bottom="1440" w:left="1440" w:header="720" w:footer="686" w:gutter="0"/>
+      <w:pgMar w:top="1440" w:right="1441" w:bottom="1440" w:left="1440" w:header="720" w:footer="686" w:gutter="0"/>
       <w:pgNumType w:fmt="decimal" w:start="1"/>
     </w:sectPr>
   </w:body>

</xml_diff>